<commit_message>
docs: fix reviewer-flagged accuracy issues in roadmap + issue script
- T-002 FILES: correct SMS paths to src/services/communications/{TelnyxSmsAdapter,smsService}.ts
- T-003 acceptance SQL: use customer_messages.is_urgent (real schema), not messages.urgency
- Owner split: real live call is T-003 (not T-012); live Stripe is T-005; T-002/T-004 are Mixed
- create-roadmap-issues.sh: fail-fast dep check (curl/jq), label errors only ignore HTTP 422, fix docs/CALL_FIX_PLAN.md path
</commit_message>
<xml_diff>
--- a/docs/PRODUCT_ROADMAP.docx
+++ b/docs/PRODUCT_ROADMAP.docx
@@ -6652,7 +6652,7 @@
         <w:rPr>
           <w:rStyle w:val="VerbatimChar"/>
         </w:rPr>
-        <w:t xml:space="preserve">src/services/telnyxSms.ts</w:t>
+        <w:t xml:space="preserve">src/services/communications/TelnyxSmsAdapter.ts</w:t>
       </w:r>
       <w:r>
         <w:t xml:space="preserve">,</w:t>
@@ -6664,7 +6664,7 @@
         <w:rPr>
           <w:rStyle w:val="VerbatimChar"/>
         </w:rPr>
-        <w:t xml:space="preserve">src/services/smsService.ts</w:t>
+        <w:t xml:space="preserve">src/services/communications/smsService.ts</w:t>
       </w:r>
       <w:r>
         <w:t xml:space="preserve">,</w:t>
@@ -6769,22 +6769,31 @@
         <w:t xml:space="preserve">scripts/verify-sms-delivery.mjs</w:t>
       </w:r>
       <w:r>
-        <w:t xml:space="preserve">: sends one SMS via the real</w:t>
-      </w:r>
-      <w:r>
-        <w:t xml:space="preserve"> </w:t>
-      </w:r>
-      <w:r>
-        <w:rPr>
-          <w:rStyle w:val="VerbatimChar"/>
-        </w:rPr>
-        <w:t xml:space="preserve">telnyxSms</w:t>
-      </w:r>
-      <w:r>
-        <w:t xml:space="preserve"> </w:t>
-      </w:r>
-      <w:r>
-        <w:t xml:space="preserve">path to a provided number, then polls</w:t>
+        <w:t xml:space="preserve">: sends one SMS via the real Telnyx path (</w:t>
+      </w:r>
+      <w:r>
+        <w:rPr>
+          <w:rStyle w:val="VerbatimChar"/>
+        </w:rPr>
+        <w:t xml:space="preserve">src/services/communications/TelnyxSmsAdapter.ts</w:t>
+      </w:r>
+      <w:r>
+        <w:t xml:space="preserve"> </w:t>
+      </w:r>
+      <w:r>
+        <w:t xml:space="preserve">→</w:t>
+      </w:r>
+      <w:r>
+        <w:t xml:space="preserve"> </w:t>
+      </w:r>
+      <w:r>
+        <w:rPr>
+          <w:rStyle w:val="VerbatimChar"/>
+        </w:rPr>
+        <w:t xml:space="preserve">smsService.ts</w:t>
+      </w:r>
+      <w:r>
+        <w:t xml:space="preserve">) to a provided number, then polls</w:t>
       </w:r>
       <w:r>
         <w:t xml:space="preserve"> </w:t>
@@ -7201,7 +7210,34 @@
         <w:t xml:space="preserve">”</w:t>
       </w:r>
       <w:r>
-        <w:t xml:space="preserve">) → verify a message row with urgency flag.</w:t>
+        <w:t xml:space="preserve">) → verify a</w:t>
+      </w:r>
+      <w:r>
+        <w:t xml:space="preserve"> </w:t>
+      </w:r>
+      <w:r>
+        <w:rPr>
+          <w:rStyle w:val="VerbatimChar"/>
+        </w:rPr>
+        <w:t xml:space="preserve">customer_messages</w:t>
+      </w:r>
+      <w:r>
+        <w:t xml:space="preserve"> </w:t>
+      </w:r>
+      <w:r>
+        <w:t xml:space="preserve">row with</w:t>
+      </w:r>
+      <w:r>
+        <w:t xml:space="preserve"> </w:t>
+      </w:r>
+      <w:r>
+        <w:rPr>
+          <w:rStyle w:val="VerbatimChar"/>
+        </w:rPr>
+        <w:t xml:space="preserve">is_urgent=true</w:t>
+      </w:r>
+      <w:r>
+        <w:t xml:space="preserve">.</w:t>
       </w:r>
       <w:r>
         <w:t xml:space="preserve"> </w:t>
@@ -7470,7 +7506,7 @@
         <w:rPr>
           <w:rStyle w:val="CommentTok"/>
         </w:rPr>
-        <w:t xml:space="preserve">-- escalation captured as an urgent message:</w:t>
+        <w:t xml:space="preserve">-- escalation captured as an urgent customer message (schema: customer_messages.is_urgent BOOLEAN):</w:t>
       </w:r>
       <w:r>
         <w:br/>
@@ -7485,7 +7521,31 @@
         <w:rPr>
           <w:rStyle w:val="NormalTok"/>
         </w:rPr>
-        <w:t xml:space="preserve"> urgency </w:t>
+        <w:t xml:space="preserve"> </w:t>
+      </w:r>
+      <w:r>
+        <w:rPr>
+          <w:rStyle w:val="FunctionTok"/>
+        </w:rPr>
+        <w:t xml:space="preserve">count</w:t>
+      </w:r>
+      <w:r>
+        <w:rPr>
+          <w:rStyle w:val="NormalTok"/>
+        </w:rPr>
+        <w:t xml:space="preserve">(</w:t>
+      </w:r>
+      <w:r>
+        <w:rPr>
+          <w:rStyle w:val="OperatorTok"/>
+        </w:rPr>
+        <w:t xml:space="preserve">*</w:t>
+      </w:r>
+      <w:r>
+        <w:rPr>
+          <w:rStyle w:val="NormalTok"/>
+        </w:rPr>
+        <w:t xml:space="preserve">) </w:t>
       </w:r>
       <w:r>
         <w:rPr>
@@ -7497,7 +7557,16 @@
         <w:rPr>
           <w:rStyle w:val="NormalTok"/>
         </w:rPr>
-        <w:t xml:space="preserve"> messages </w:t>
+        <w:t xml:space="preserve"> customer_messages</w:t>
+      </w:r>
+      <w:r>
+        <w:br/>
+      </w:r>
+      <w:r>
+        <w:rPr>
+          <w:rStyle w:val="NormalTok"/>
+        </w:rPr>
+        <w:t xml:space="preserve">  </w:t>
       </w:r>
       <w:r>
         <w:rPr>
@@ -7509,6 +7578,42 @@
         <w:rPr>
           <w:rStyle w:val="NormalTok"/>
         </w:rPr>
+        <w:t xml:space="preserve"> is_urgent </w:t>
+      </w:r>
+      <w:r>
+        <w:rPr>
+          <w:rStyle w:val="OperatorTok"/>
+        </w:rPr>
+        <w:t xml:space="preserve">=</w:t>
+      </w:r>
+      <w:r>
+        <w:rPr>
+          <w:rStyle w:val="NormalTok"/>
+        </w:rPr>
+        <w:t xml:space="preserve"> </w:t>
+      </w:r>
+      <w:r>
+        <w:rPr>
+          <w:rStyle w:val="KeywordTok"/>
+        </w:rPr>
+        <w:t xml:space="preserve">true</w:t>
+      </w:r>
+      <w:r>
+        <w:rPr>
+          <w:rStyle w:val="NormalTok"/>
+        </w:rPr>
+        <w:t xml:space="preserve"> </w:t>
+      </w:r>
+      <w:r>
+        <w:rPr>
+          <w:rStyle w:val="KeywordTok"/>
+        </w:rPr>
+        <w:t xml:space="preserve">AND</w:t>
+      </w:r>
+      <w:r>
+        <w:rPr>
+          <w:rStyle w:val="NormalTok"/>
+        </w:rPr>
         <w:t xml:space="preserve"> created_at </w:t>
       </w:r>
       <w:r>
@@ -7557,13 +7662,13 @@
         <w:rPr>
           <w:rStyle w:val="NormalTok"/>
         </w:rPr>
-        <w:t xml:space="preserve">;           </w:t>
+        <w:t xml:space="preserve">;                 </w:t>
       </w:r>
       <w:r>
         <w:rPr>
           <w:rStyle w:val="CommentTok"/>
         </w:rPr>
-        <w:t xml:space="preserve">-- 'urgent'</w:t>
+        <w:t xml:space="preserve">-- &gt;= 1</w:t>
       </w:r>
     </w:p>
     <w:p>
@@ -19695,7 +19800,7 @@
         <w:t xml:space="preserve"> </w:t>
       </w:r>
       <w:r>
-        <w:t xml:space="preserve">(needs an external account/phone/bank/live call): T-001 (rotate creds), T-002 (10DLC/SMS live), the live-mode half of T-004 (real Stripe card), T-012 (real test call).</w:t>
+        <w:t xml:space="preserve">(needs an external account/phone/bank/live call): T-001 (rotate creds), T-003 (real live validation call), T-005 (live-mode Stripe + real card/bank), T-013 (owner onboarding walk-through).</w:t>
       </w:r>
     </w:p>
     <w:p>
@@ -19717,7 +19822,7 @@
         <w:t xml:space="preserve"> </w:t>
       </w:r>
       <w:r>
-        <w:t xml:space="preserve">(Claude writes code; human does the external step): T-108, T-205, T-206, T-207, T-304.</w:t>
+        <w:t xml:space="preserve">(Claude writes code; human does the external step): T-002 (Claude builds the SMS gate + delivery script; human does 10DLC registration), T-004 (Claude wires Stripe test-mode; human confirms dashboard/keys), T-108, T-205, T-206, T-207, T-304.</w:t>
       </w:r>
     </w:p>
     <w:bookmarkEnd w:id="74"/>

</xml_diff>